<commit_message>
v3.9: withdraw the stated cause of the mislabelled 3.3 record
Revision 3.8 said Zenodo archived whatever the misplaced v3.3 tag pointed at.
That assumes the GitHub integration created the record, and the repository's
webhook delivery log shows no deliveries, so the integration appears never to
have archived anything and the record's provenance is not established. The tag
placement itself is checkable and stands: v3.3 points at commit e3a4297, whose
message is "v3.1: correct validation figure".

This is a separate revision rather than an edit to 3.8 because 3.8 was already
pushed and tagged. A published tag is not rewritten to absorb a later
correction, even when the correction is small and the tag is a day old.

Citation metadata moves to 3.9.0 and the paper's docx and pdf are rebuilt.

Co-Authored-By: Claude Opus 5 <noreply@anthropic.com>
Claude-Session: https://claude.ai/code/session_01LPqG2Nu1nLWwsTWm4LL7jf
</commit_message>
<xml_diff>
--- a/paper/mcp-frame-paper-v3.docx
+++ b/paper/mcp-frame-paper-v3.docx
@@ -10632,7 +10632,7 @@
           <w:sz w:val="21"/>
           <w:szCs w:val="21"/>
         </w:rPr>
-        <w:t xml:space="preserve">The version DOIs are more specific and, in one case, misleading. 10.5281/zenodo.22641813 archives version 1.0.0 under its original title, "Measuring the MCP Supply Chain: Eight Null Results and a Population That Is Not the Population", whose findings are superseded here. 10.5281/zenodo.22664719 is labelled version 3.3 but archives the version 3.1 tree, because the </w:t>
+        <w:t xml:space="preserve">The version DOIs are more specific and, in one case, misleading. 10.5281/zenodo.22641813 archives version 1.0.0 under its original title, "Measuring the MCP Supply Chain: Eight Null Results and a Population That Is Not the Population", whose findings are superseded here. 10.5281/zenodo.22664719 is labelled version 3.3 but archives the version 3.1 tree. Earlier revisions explained that as the </w:t>
       </w:r>
       <w:r>
         <w:rPr>
@@ -10648,7 +10648,39 @@
           <w:sz w:val="21"/>
           <w:szCs w:val="21"/>
         </w:rPr>
-        <w:t xml:space="preserve"> git tag was placed on the version 3.1 commit and Zenodo archives whatever the tag points at. It contains neither the Section 6 correction nor the lock format proposal. Versions 1.0.1, 1.0.2 and 2.0 were never archived, and versions of this paper before 3.3 stated that 2.0 had its own DOI, which was not true.</w:t>
+        <w:t xml:space="preserve"> git tag having been placed on the version 3.1 commit, with Zenodo archiving whatever the tag points at. The tag placement is real and checkable: </w:t>
+      </w:r>
+      <w:r>
+        <w:rPr>
+          <w:rFonts w:ascii="Consolas" w:cs="Consolas" w:eastAsia="Consolas" w:hAnsi="Consolas"/>
+          <w:sz w:val="19"/>
+          <w:szCs w:val="19"/>
+        </w:rPr>
+        <w:t xml:space="preserve">v3.3</w:t>
+      </w:r>
+      <w:r>
+        <w:rPr>
+          <w:rFonts w:ascii="Georgia" w:cs="Georgia" w:eastAsia="Georgia" w:hAnsi="Georgia"/>
+          <w:sz w:val="21"/>
+          <w:szCs w:val="21"/>
+        </w:rPr>
+        <w:t xml:space="preserve"> points at commit </w:t>
+      </w:r>
+      <w:r>
+        <w:rPr>
+          <w:rFonts w:ascii="Consolas" w:cs="Consolas" w:eastAsia="Consolas" w:hAnsi="Consolas"/>
+          <w:sz w:val="19"/>
+          <w:szCs w:val="19"/>
+        </w:rPr>
+        <w:t xml:space="preserve">e3a4297</w:t>
+      </w:r>
+      <w:r>
+        <w:rPr>
+          <w:rFonts w:ascii="Georgia" w:cs="Georgia" w:eastAsia="Georgia" w:hAnsi="Georgia"/>
+          <w:sz w:val="21"/>
+          <w:szCs w:val="21"/>
+        </w:rPr>
+        <w:t xml:space="preserve">, whose message is "v3.1: correct validation figure". The rest of the explanation is withdrawn, because it assumes the GitHub integration created the record, and the repository's webhook delivery log shows no deliveries. How the 3.1 tree came to sit in a record labelled 3.3 is therefore not established here. It contains neither the Section 6 correction nor the lock format proposal. Versions 1.0.1, 1.0.2 and 2.0 were never archived, and versions of this paper before 3.3 stated that 2.0 had its own DOI, which was not true.</w:t>
       </w:r>
     </w:p>
     <w:p>
@@ -11216,7 +11248,25 @@
           <w:sz w:val="21"/>
           <w:szCs w:val="21"/>
         </w:rPr>
-        <w:t xml:space="preserve"> Corrected the archive references. Version 3.3 cited 10.5281/zenodo.22664719 as the archive of itself. That record is labelled version 3.3 but contains the version 3.1 tree, because the </w:t>
+        <w:t xml:space="preserve"> Corrected the archive references. Version 3.3 cited 10.5281/zenodo.22664719 as the archive of itself. That record is labelled version 3.3 but contains the version 3.1 tree, and a Zenodo record's files cannot be replaced after minting. Revision 3.8 withdraws the stated cause. The paper cited the concept DOI, 10.5281/zenodo.22641812, on the assumption that it resolves to the most recent version and so would not need changing at each revision. Revision 3.8 withdraws that assumption: the DOI resolves to the most recent </w:t>
+      </w:r>
+      <w:r>
+        <w:rPr>
+          <w:rFonts w:ascii="Georgia" w:cs="Georgia" w:eastAsia="Georgia" w:hAnsi="Georgia"/>
+          <w:i/>
+          <w:iCs/>
+          <w:sz w:val="21"/>
+          <w:szCs w:val="21"/>
+        </w:rPr>
+        <w:t xml:space="preserve">archived</w:t>
+      </w:r>
+      <w:r>
+        <w:rPr>
+          <w:rFonts w:ascii="Georgia" w:cs="Georgia" w:eastAsia="Georgia" w:hAnsi="Georgia"/>
+          <w:sz w:val="21"/>
+          <w:szCs w:val="21"/>
+        </w:rPr>
+        <w:t xml:space="preserve"> version, and nothing after 3.3 has been archived. Also released the result files Sections 5 and 6 depend on, which had never been published: </w:t>
       </w:r>
       <w:r>
         <w:rPr>
@@ -11224,33 +11274,15 @@
           <w:sz w:val="19"/>
           <w:szCs w:val="19"/>
         </w:rPr>
-        <w:t xml:space="preserve">v3.3</w:t>
-      </w:r>
-      <w:r>
-        <w:rPr>
-          <w:rFonts w:ascii="Georgia" w:cs="Georgia" w:eastAsia="Georgia" w:hAnsi="Georgia"/>
-          <w:sz w:val="21"/>
-          <w:szCs w:val="21"/>
-        </w:rPr>
-        <w:t xml:space="preserve"> tag was placed on the version 3.1 commit, and a Zenodo record's files cannot be replaced after minting. The paper cited the concept DOI, 10.5281/zenodo.22641812, on the assumption that it resolves to the most recent version and so would not need changing at each revision. Revision 3.8 withdraws that assumption: the DOI resolves to the most recent </w:t>
-      </w:r>
-      <w:r>
-        <w:rPr>
-          <w:rFonts w:ascii="Georgia" w:cs="Georgia" w:eastAsia="Georgia" w:hAnsi="Georgia"/>
-          <w:i/>
-          <w:iCs/>
-          <w:sz w:val="21"/>
-          <w:szCs w:val="21"/>
-        </w:rPr>
-        <w:t xml:space="preserve">archived</w:t>
-      </w:r>
-      <w:r>
-        <w:rPr>
-          <w:rFonts w:ascii="Georgia" w:cs="Georgia" w:eastAsia="Georgia" w:hAnsi="Georgia"/>
-          <w:sz w:val="21"/>
-          <w:szCs w:val="21"/>
-        </w:rPr>
-        <w:t xml:space="preserve"> version, and nothing after 3.3 has been archived. Also released the result files Sections 5 and 6 depend on, which had never been published: </w:t>
+        <w:t xml:space="preserve">cluster_bootstrap.json</w:t>
+      </w:r>
+      <w:r>
+        <w:rPr>
+          <w:rFonts w:ascii="Georgia" w:cs="Georgia" w:eastAsia="Georgia" w:hAnsi="Georgia"/>
+          <w:sz w:val="21"/>
+          <w:szCs w:val="21"/>
+        </w:rPr>
+        <w:t xml:space="preserve"> and </w:t>
       </w:r>
       <w:r>
         <w:rPr>
@@ -11258,15 +11290,15 @@
           <w:sz w:val="19"/>
           <w:szCs w:val="19"/>
         </w:rPr>
-        <w:t xml:space="preserve">cluster_bootstrap.json</w:t>
-      </w:r>
-      <w:r>
-        <w:rPr>
-          <w:rFonts w:ascii="Georgia" w:cs="Georgia" w:eastAsia="Georgia" w:hAnsi="Georgia"/>
-          <w:sz w:val="21"/>
-          <w:szCs w:val="21"/>
-        </w:rPr>
-        <w:t xml:space="preserve"> and </w:t>
+        <w:t xml:space="preserve">design_effect_corrected.json</w:t>
+      </w:r>
+      <w:r>
+        <w:rPr>
+          <w:rFonts w:ascii="Georgia" w:cs="Georgia" w:eastAsia="Georgia" w:hAnsi="Georgia"/>
+          <w:sz w:val="21"/>
+          <w:szCs w:val="21"/>
+        </w:rPr>
+        <w:t xml:space="preserve"> carry the z values Section 6 reports, </w:t>
       </w:r>
       <w:r>
         <w:rPr>
@@ -11274,15 +11306,15 @@
           <w:sz w:val="19"/>
           <w:szCs w:val="19"/>
         </w:rPr>
-        <w:t xml:space="preserve">design_effect_corrected.json</w:t>
-      </w:r>
-      <w:r>
-        <w:rPr>
-          <w:rFonts w:ascii="Georgia" w:cs="Georgia" w:eastAsia="Georgia" w:hAnsi="Georgia"/>
-          <w:sz w:val="21"/>
-          <w:szCs w:val="21"/>
-        </w:rPr>
-        <w:t xml:space="preserve"> carry the z values Section 6 reports, </w:t>
+        <w:t xml:space="preserve">publisher_clustering.json</w:t>
+      </w:r>
+      <w:r>
+        <w:rPr>
+          <w:rFonts w:ascii="Georgia" w:cs="Georgia" w:eastAsia="Georgia" w:hAnsi="Georgia"/>
+          <w:sz w:val="21"/>
+          <w:szCs w:val="21"/>
+        </w:rPr>
+        <w:t xml:space="preserve"> and </w:t>
       </w:r>
       <w:r>
         <w:rPr>
@@ -11290,15 +11322,39 @@
           <w:sz w:val="19"/>
           <w:szCs w:val="19"/>
         </w:rPr>
-        <w:t xml:space="preserve">publisher_clustering.json</w:t>
-      </w:r>
-      <w:r>
-        <w:rPr>
-          <w:rFonts w:ascii="Georgia" w:cs="Georgia" w:eastAsia="Georgia" w:hAnsi="Georgia"/>
-          <w:sz w:val="21"/>
-          <w:szCs w:val="21"/>
-        </w:rPr>
-        <w:t xml:space="preserve"> and </w:t>
+        <w:t xml:space="preserve">publisher_icc.json</w:t>
+      </w:r>
+      <w:r>
+        <w:rPr>
+          <w:rFonts w:ascii="Georgia" w:cs="Georgia" w:eastAsia="Georgia" w:hAnsi="Georgia"/>
+          <w:sz w:val="21"/>
+          <w:szCs w:val="21"/>
+        </w:rPr>
+        <w:t xml:space="preserve"> are the whole of Section 5, and the per-package validation records make the 6,144 of 6,146 figure reproducible rather than requiring a reader to sum two arm summaries, which reproduces the figure revision 3.1 retracts. The paper claimed its data was released; for those sections it was not.</w:t>
+      </w:r>
+    </w:p>
+    <w:p>
+      <w:pPr>
+        <w:spacing w:after="160"/>
+        <w:jc w:val="left"/>
+      </w:pPr>
+      <w:r>
+        <w:rPr>
+          <w:rFonts w:ascii="Georgia" w:cs="Georgia" w:eastAsia="Georgia" w:hAnsi="Georgia"/>
+          <w:b/>
+          <w:bCs/>
+          <w:sz w:val="21"/>
+          <w:szCs w:val="21"/>
+        </w:rPr>
+        <w:t xml:space="preserve">3.5</w:t>
+      </w:r>
+      <w:r>
+        <w:rPr>
+          <w:rFonts w:ascii="Georgia" w:cs="Georgia" w:eastAsia="Georgia" w:hAnsi="Georgia"/>
+          <w:sz w:val="21"/>
+          <w:szCs w:val="21"/>
+        </w:rPr>
+        <w:t xml:space="preserve"> Four corrections and one new result, none of which changes a published number. Prompted by a question from the maintainer of mcp-audit about how often an MCP server package's </w:t>
       </w:r>
       <w:r>
         <w:rPr>
@@ -11306,15 +11362,15 @@
           <w:sz w:val="19"/>
           <w:szCs w:val="19"/>
         </w:rPr>
-        <w:t xml:space="preserve">publisher_icc.json</w:t>
-      </w:r>
-      <w:r>
-        <w:rPr>
-          <w:rFonts w:ascii="Georgia" w:cs="Georgia" w:eastAsia="Georgia" w:hAnsi="Georgia"/>
-          <w:sz w:val="21"/>
-          <w:szCs w:val="21"/>
-        </w:rPr>
-        <w:t xml:space="preserve"> are the whole of Section 5, and the per-package validation records make the 6,144 of 6,146 figure reproducible rather than requiring a reader to sum two arm summaries, which reproduces the figure revision 3.1 retracts. The paper claimed its data was released; for those sections it was not.</w:t>
+        <w:t xml:space="preserve">latest</w:t>
+      </w:r>
+      <w:r>
+        <w:rPr>
+          <w:rFonts w:ascii="Georgia" w:cs="Georgia" w:eastAsia="Georgia" w:hAnsi="Georgia"/>
+          <w:sz w:val="21"/>
+          <w:szCs w:val="21"/>
+        </w:rPr>
+        <w:t xml:space="preserve"> is deprecated.</w:t>
       </w:r>
     </w:p>
     <w:p>
@@ -11330,15 +11386,15 @@
           <w:sz w:val="21"/>
           <w:szCs w:val="21"/>
         </w:rPr>
-        <w:t xml:space="preserve">3.5</w:t>
-      </w:r>
-      <w:r>
-        <w:rPr>
-          <w:rFonts w:ascii="Georgia" w:cs="Georgia" w:eastAsia="Georgia" w:hAnsi="Georgia"/>
-          <w:sz w:val="21"/>
-          <w:szCs w:val="21"/>
-        </w:rPr>
-        <w:t xml:space="preserve"> Four corrections and one new result, none of which changes a published number. Prompted by a question from the maintainer of mcp-audit about how often an MCP server package's </w:t>
+        <w:t xml:space="preserve">The release shipped the wrong vintage of the corpus walk.</w:t>
+      </w:r>
+      <w:r>
+        <w:rPr>
+          <w:rFonts w:ascii="Georgia" w:cs="Georgia" w:eastAsia="Georgia" w:hAnsi="Georgia"/>
+          <w:sz w:val="21"/>
+          <w:szCs w:val="21"/>
+        </w:rPr>
+        <w:t xml:space="preserve"> Section 1's figures as published in revisions 3.2 to 3.5, a median of 93 packages and a maximum of 618, come from a walk made with the corrected resolver. That walk lived on a temporary path and was never copied into the repository. What </w:t>
       </w:r>
       <w:r>
         <w:rPr>
@@ -11346,39 +11402,15 @@
           <w:sz w:val="19"/>
           <w:szCs w:val="19"/>
         </w:rPr>
-        <w:t xml:space="preserve">latest</w:t>
-      </w:r>
-      <w:r>
-        <w:rPr>
-          <w:rFonts w:ascii="Georgia" w:cs="Georgia" w:eastAsia="Georgia" w:hAnsi="Georgia"/>
-          <w:sz w:val="21"/>
-          <w:szCs w:val="21"/>
-        </w:rPr>
-        <w:t xml:space="preserve"> is deprecated.</w:t>
-      </w:r>
-    </w:p>
-    <w:p>
-      <w:pPr>
-        <w:spacing w:after="160"/>
-        <w:jc w:val="left"/>
-      </w:pPr>
-      <w:r>
-        <w:rPr>
-          <w:rFonts w:ascii="Georgia" w:cs="Georgia" w:eastAsia="Georgia" w:hAnsi="Georgia"/>
-          <w:b/>
-          <w:bCs/>
-          <w:sz w:val="21"/>
-          <w:szCs w:val="21"/>
-        </w:rPr>
-        <w:t xml:space="preserve">The release shipped the wrong vintage of the corpus walk.</w:t>
-      </w:r>
-      <w:r>
-        <w:rPr>
-          <w:rFonts w:ascii="Georgia" w:cs="Georgia" w:eastAsia="Georgia" w:hAnsi="Georgia"/>
-          <w:sz w:val="21"/>
-          <w:szCs w:val="21"/>
-        </w:rPr>
-        <w:t xml:space="preserve"> Section 1's figures as published in revisions 3.2 to 3.5, a median of 93 packages and a maximum of 618, come from a walk made with the corrected resolver. That walk lived on a temporary path and was never copied into the repository. What </w:t>
+        <w:t xml:space="preserve">release/data/walk250.jsonl</w:t>
+      </w:r>
+      <w:r>
+        <w:rPr>
+          <w:rFonts w:ascii="Georgia" w:cs="Georgia" w:eastAsia="Georgia" w:hAnsi="Georgia"/>
+          <w:sz w:val="21"/>
+          <w:szCs w:val="21"/>
+        </w:rPr>
+        <w:t xml:space="preserve"> contains is the pre-correction walk, whose median is 96.5 and maximum 589, which are the two figures revision 3.2 retracted. A reader reproducing Section 1 from the released data recovered the retracted numbers. The corrected walk has been rebuilt and is released as </w:t>
       </w:r>
       <w:r>
         <w:rPr>
@@ -11386,15 +11418,15 @@
           <w:sz w:val="19"/>
           <w:szCs w:val="19"/>
         </w:rPr>
-        <w:t xml:space="preserve">release/data/walk250.jsonl</w:t>
-      </w:r>
-      <w:r>
-        <w:rPr>
-          <w:rFonts w:ascii="Georgia" w:cs="Georgia" w:eastAsia="Georgia" w:hAnsi="Georgia"/>
-          <w:sz w:val="21"/>
-          <w:szCs w:val="21"/>
-        </w:rPr>
-        <w:t xml:space="preserve"> contains is the pre-correction walk, whose median is 96.5 and maximum 589, which are the two figures revision 3.2 retracted. A reader reproducing Section 1 from the released data recovered the retracted numbers. The corrected walk has been rebuilt and is released as </w:t>
+        <w:t xml:space="preserve">walk250_corrected_today.jsonl</w:t>
+      </w:r>
+      <w:r>
+        <w:rPr>
+          <w:rFonts w:ascii="Georgia" w:cs="Georgia" w:eastAsia="Georgia" w:hAnsi="Georgia"/>
+          <w:sz w:val="21"/>
+          <w:szCs w:val="21"/>
+        </w:rPr>
+        <w:t xml:space="preserve">, at a median of 94 and a maximum of 619 after ten days of registry movement, and revision 3.6 restates Section 1 on that file rather than on a walk that no longer exists. A second file, </w:t>
       </w:r>
       <w:r>
         <w:rPr>
@@ -11402,15 +11434,39 @@
           <w:sz w:val="19"/>
           <w:szCs w:val="19"/>
         </w:rPr>
-        <w:t xml:space="preserve">walk250_corrected_today.jsonl</w:t>
-      </w:r>
-      <w:r>
-        <w:rPr>
-          <w:rFonts w:ascii="Georgia" w:cs="Georgia" w:eastAsia="Georgia" w:hAnsi="Georgia"/>
-          <w:sz w:val="21"/>
-          <w:szCs w:val="21"/>
-        </w:rPr>
-        <w:t xml:space="preserve">, at a median of 94 and a maximum of 619 after ten days of registry movement, and revision 3.6 restates Section 1 on that file rather than on a walk that no longer exists. A second file, </w:t>
+        <w:t xml:space="preserve">walk250_corrected_asof.jsonl</w:t>
+      </w:r>
+      <w:r>
+        <w:rPr>
+          <w:rFonts w:ascii="Georgia" w:cs="Georgia" w:eastAsia="Georgia" w:hAnsi="Georgia"/>
+          <w:sz w:val="21"/>
+          <w:szCs w:val="21"/>
+        </w:rPr>
+        <w:t xml:space="preserve">, resolves the same roots against the original walk date's registry, rebuilt by discarding versions published after that date, which is what makes the drift measurement below separable from the resolver.</w:t>
+      </w:r>
+    </w:p>
+    <w:p>
+      <w:pPr>
+        <w:spacing w:after="160"/>
+        <w:jc w:val="left"/>
+      </w:pPr>
+      <w:r>
+        <w:rPr>
+          <w:rFonts w:ascii="Georgia" w:cs="Georgia" w:eastAsia="Georgia" w:hAnsi="Georgia"/>
+          <w:b/>
+          <w:bCs/>
+          <w:sz w:val="21"/>
+          <w:szCs w:val="21"/>
+        </w:rPr>
+        <w:t xml:space="preserve">The sampling frame cannot contain a deprecated package</w:t>
+      </w:r>
+      <w:r>
+        <w:rPr>
+          <w:rFonts w:ascii="Georgia" w:cs="Georgia" w:eastAsia="Georgia" w:hAnsi="Georgia"/>
+          <w:sz w:val="21"/>
+          <w:szCs w:val="21"/>
+        </w:rPr>
+        <w:t xml:space="preserve">, which Section 9 now states. The registry search API does not return them. Eleven of the reference </w:t>
       </w:r>
       <w:r>
         <w:rPr>
@@ -11418,39 +11474,15 @@
           <w:sz w:val="19"/>
           <w:szCs w:val="19"/>
         </w:rPr>
-        <w:t xml:space="preserve">walk250_corrected_asof.jsonl</w:t>
-      </w:r>
-      <w:r>
-        <w:rPr>
-          <w:rFonts w:ascii="Georgia" w:cs="Georgia" w:eastAsia="Georgia" w:hAnsi="Georgia"/>
-          <w:sz w:val="21"/>
-          <w:szCs w:val="21"/>
-        </w:rPr>
-        <w:t xml:space="preserve">, resolves the same roots against the original walk date's registry, rebuilt by discarding versions published after that date, which is what makes the drift measurement below separable from the resolver.</w:t>
-      </w:r>
-    </w:p>
-    <w:p>
-      <w:pPr>
-        <w:spacing w:after="160"/>
-        <w:jc w:val="left"/>
-      </w:pPr>
-      <w:r>
-        <w:rPr>
-          <w:rFonts w:ascii="Georgia" w:cs="Georgia" w:eastAsia="Georgia" w:hAnsi="Georgia"/>
-          <w:b/>
-          <w:bCs/>
-          <w:sz w:val="21"/>
-          <w:szCs w:val="21"/>
-        </w:rPr>
-        <w:t xml:space="preserve">The sampling frame cannot contain a deprecated package</w:t>
-      </w:r>
-      <w:r>
-        <w:rPr>
-          <w:rFonts w:ascii="Georgia" w:cs="Georgia" w:eastAsia="Georgia" w:hAnsi="Georgia"/>
-          <w:sz w:val="21"/>
-          <w:szCs w:val="21"/>
-        </w:rPr>
-        <w:t xml:space="preserve">, which Section 9 now states. The registry search API does not return them. Eleven of the reference </w:t>
+        <w:t xml:space="preserve">@modelcontextprotocol/server-*</w:t>
+      </w:r>
+      <w:r>
+        <w:rPr>
+          <w:rFonts w:ascii="Georgia" w:cs="Georgia" w:eastAsia="Georgia" w:hAnsi="Georgia"/>
+          <w:sz w:val="21"/>
+          <w:szCs w:val="21"/>
+        </w:rPr>
+        <w:t xml:space="preserve"> packages have a deprecated </w:t>
       </w:r>
       <w:r>
         <w:rPr>
@@ -11458,15 +11490,39 @@
           <w:sz w:val="19"/>
           <w:szCs w:val="19"/>
         </w:rPr>
-        <w:t xml:space="preserve">@modelcontextprotocol/server-*</w:t>
-      </w:r>
-      <w:r>
-        <w:rPr>
-          <w:rFonts w:ascii="Georgia" w:cs="Georgia" w:eastAsia="Georgia" w:hAnsi="Georgia"/>
-          <w:sz w:val="21"/>
-          <w:szCs w:val="21"/>
-        </w:rPr>
-        <w:t xml:space="preserve"> packages have a deprecated </w:t>
+        <w:t xml:space="preserve">latest</w:t>
+      </w:r>
+      <w:r>
+        <w:rPr>
+          <w:rFonts w:ascii="Georgia" w:cs="Georgia" w:eastAsia="Georgia" w:hAnsi="Georgia"/>
+          <w:sz w:val="21"/>
+          <w:szCs w:val="21"/>
+        </w:rPr>
+        <w:t xml:space="preserve"> and every published version deprecated, and not one is reachable through the enumeration or present in this corpus.</w:t>
+      </w:r>
+    </w:p>
+    <w:p>
+      <w:pPr>
+        <w:spacing w:after="160"/>
+        <w:jc w:val="left"/>
+      </w:pPr>
+      <w:r>
+        <w:rPr>
+          <w:rFonts w:ascii="Georgia" w:cs="Georgia" w:eastAsia="Georgia" w:hAnsi="Georgia"/>
+          <w:b/>
+          <w:bCs/>
+          <w:sz w:val="21"/>
+          <w:szCs w:val="21"/>
+        </w:rPr>
+        <w:t xml:space="preserve">The released code could not be run.</w:t>
+      </w:r>
+      <w:r>
+        <w:rPr>
+          <w:rFonts w:ascii="Georgia" w:cs="Georgia" w:eastAsia="Georgia" w:hAnsi="Georgia"/>
+          <w:sz w:val="21"/>
+          <w:szCs w:val="21"/>
+        </w:rPr>
+        <w:t xml:space="preserve"> No requirements file, no mention of </w:t>
       </w:r>
       <w:r>
         <w:rPr>
@@ -11474,15 +11530,15 @@
           <w:sz w:val="19"/>
           <w:szCs w:val="19"/>
         </w:rPr>
-        <w:t xml:space="preserve">latest</w:t>
-      </w:r>
-      <w:r>
-        <w:rPr>
-          <w:rFonts w:ascii="Georgia" w:cs="Georgia" w:eastAsia="Georgia" w:hAnsi="Georgia"/>
-          <w:sz w:val="21"/>
-          <w:szCs w:val="21"/>
-        </w:rPr>
-        <w:t xml:space="preserve"> and every published version deprecated, and not one is reachable through the enumeration or present in this corpus.</w:t>
+        <w:t xml:space="preserve">node-semver</w:t>
+      </w:r>
+      <w:r>
+        <w:rPr>
+          <w:rFonts w:ascii="Georgia" w:cs="Georgia" w:eastAsia="Georgia" w:hAnsi="Georgia"/>
+          <w:sz w:val="21"/>
+          <w:szCs w:val="21"/>
+        </w:rPr>
+        <w:t xml:space="preserve"> anywhere, and a working copy on a path that no longer exists. Fixed here.</w:t>
       </w:r>
     </w:p>
     <w:p>
@@ -11498,15 +11554,15 @@
           <w:sz w:val="21"/>
           <w:szCs w:val="21"/>
         </w:rPr>
-        <w:t xml:space="preserve">The released code could not be run.</w:t>
-      </w:r>
-      <w:r>
-        <w:rPr>
-          <w:rFonts w:ascii="Georgia" w:cs="Georgia" w:eastAsia="Georgia" w:hAnsi="Georgia"/>
-          <w:sz w:val="21"/>
-          <w:szCs w:val="21"/>
-        </w:rPr>
-        <w:t xml:space="preserve"> No requirements file, no mention of </w:t>
+        <w:t xml:space="preserve">Two resolvers existed in the repository and only one was validated.</w:t>
+      </w:r>
+      <w:r>
+        <w:rPr>
+          <w:rFonts w:ascii="Georgia" w:cs="Georgia" w:eastAsia="Georgia" w:hAnsi="Georgia"/>
+          <w:sz w:val="21"/>
+          <w:szCs w:val="21"/>
+        </w:rPr>
+        <w:t xml:space="preserve"> </w:t>
       </w:r>
       <w:r>
         <w:rPr>
@@ -11514,39 +11570,15 @@
           <w:sz w:val="19"/>
           <w:szCs w:val="19"/>
         </w:rPr>
-        <w:t xml:space="preserve">node-semver</w:t>
-      </w:r>
-      <w:r>
-        <w:rPr>
-          <w:rFonts w:ascii="Georgia" w:cs="Georgia" w:eastAsia="Georgia" w:hAnsi="Georgia"/>
-          <w:sz w:val="21"/>
-          <w:szCs w:val="21"/>
-        </w:rPr>
-        <w:t xml:space="preserve"> anywhere, and a working copy on a path that no longer exists. Fixed here.</w:t>
-      </w:r>
-    </w:p>
-    <w:p>
-      <w:pPr>
-        <w:spacing w:after="160"/>
-        <w:jc w:val="left"/>
-      </w:pPr>
-      <w:r>
-        <w:rPr>
-          <w:rFonts w:ascii="Georgia" w:cs="Georgia" w:eastAsia="Georgia" w:hAnsi="Georgia"/>
-          <w:b/>
-          <w:bCs/>
-          <w:sz w:val="21"/>
-          <w:szCs w:val="21"/>
-        </w:rPr>
-        <w:t xml:space="preserve">Two resolvers existed in the repository and only one was validated.</w:t>
-      </w:r>
-      <w:r>
-        <w:rPr>
-          <w:rFonts w:ascii="Georgia" w:cs="Georgia" w:eastAsia="Georgia" w:hAnsi="Georgia"/>
-          <w:sz w:val="21"/>
-          <w:szCs w:val="21"/>
-        </w:rPr>
-        <w:t xml:space="preserve"> </w:t>
+        <w:t xml:space="preserve">install_gap.resolve_at</w:t>
+      </w:r>
+      <w:r>
+        <w:rPr>
+          <w:rFonts w:ascii="Georgia" w:cs="Georgia" w:eastAsia="Georgia" w:hAnsi="Georgia"/>
+          <w:sz w:val="21"/>
+          <w:szCs w:val="21"/>
+        </w:rPr>
+        <w:t xml:space="preserve"> implements npm's rule and is what Section 2.2 describes and what the 6,144 of 6,146 validation covers. </w:t>
       </w:r>
       <w:r>
         <w:rPr>
@@ -11554,15 +11586,15 @@
           <w:sz w:val="19"/>
           <w:szCs w:val="19"/>
         </w:rPr>
-        <w:t xml:space="preserve">install_gap.resolve_at</w:t>
-      </w:r>
-      <w:r>
-        <w:rPr>
-          <w:rFonts w:ascii="Georgia" w:cs="Georgia" w:eastAsia="Georgia" w:hAnsi="Georgia"/>
-          <w:sz w:val="21"/>
-          <w:szCs w:val="21"/>
-        </w:rPr>
-        <w:t xml:space="preserve"> implements npm's rule and is what Section 2.2 describes and what the 6,144 of 6,146 validation covers. </w:t>
+        <w:t xml:space="preserve">mcplib.npm_resolve</w:t>
+      </w:r>
+      <w:r>
+        <w:rPr>
+          <w:rFonts w:ascii="Georgia" w:cs="Georgia" w:eastAsia="Georgia" w:hAnsi="Georgia"/>
+          <w:sz w:val="21"/>
+          <w:szCs w:val="21"/>
+        </w:rPr>
+        <w:t xml:space="preserve"> implements neither the dist-tag preference nor the deprecation preference, and the shipped </w:t>
       </w:r>
       <w:r>
         <w:rPr>
@@ -11570,15 +11602,77 @@
           <w:sz w:val="19"/>
           <w:szCs w:val="19"/>
         </w:rPr>
-        <w:t xml:space="preserve">mcplib.npm_resolve</w:t>
-      </w:r>
-      <w:r>
-        <w:rPr>
-          <w:rFonts w:ascii="Georgia" w:cs="Georgia" w:eastAsia="Georgia" w:hAnsi="Georgia"/>
-          <w:sz w:val="21"/>
-          <w:szCs w:val="21"/>
-        </w:rPr>
-        <w:t xml:space="preserve"> implements neither the dist-tag preference nor the deprecation preference, and the shipped </w:t>
+        <w:t xml:space="preserve">walk250.jsonl</w:t>
+      </w:r>
+      <w:r>
+        <w:rPr>
+          <w:rFonts w:ascii="Georgia" w:cs="Georgia" w:eastAsia="Georgia" w:hAnsi="Georgia"/>
+          <w:sz w:val="21"/>
+          <w:szCs w:val="21"/>
+        </w:rPr>
+        <w:t xml:space="preserve"> is its output. Rebuilding the corpus through the corrected resolver moves 160 of 250 trees and 507 nodes, and confirms the figures Section 1 already carries.</w:t>
+      </w:r>
+    </w:p>
+    <w:p>
+      <w:pPr>
+        <w:spacing w:after="160"/>
+        <w:jc w:val="left"/>
+      </w:pPr>
+      <w:r>
+        <w:rPr>
+          <w:rFonts w:ascii="Georgia" w:cs="Georgia" w:eastAsia="Georgia" w:hAnsi="Georgia"/>
+          <w:b/>
+          <w:bCs/>
+          <w:sz w:val="21"/>
+          <w:szCs w:val="21"/>
+        </w:rPr>
+        <w:t xml:space="preserve">New result: ten days of registry movement changes 73.6% of servers</w:t>
+      </w:r>
+      <w:r>
+        <w:rPr>
+          <w:rFonts w:ascii="Georgia" w:cs="Georgia" w:eastAsia="Georgia" w:hAnsi="Georgia"/>
+          <w:sz w:val="21"/>
+          <w:szCs w:val="21"/>
+        </w:rPr>
+        <w:t xml:space="preserve">, reported in Section 1. The decomposition is exact: 507 nodes from the resolver correction, 12 from drift, 495 combined and 495 measured directly.</w:t>
+      </w:r>
+    </w:p>
+    <w:p>
+      <w:pPr>
+        <w:spacing w:after="160"/>
+        <w:jc w:val="left"/>
+      </w:pPr>
+      <w:r>
+        <w:rPr>
+          <w:rFonts w:ascii="Georgia" w:cs="Georgia" w:eastAsia="Georgia" w:hAnsi="Georgia"/>
+          <w:b/>
+          <w:bCs/>
+          <w:sz w:val="21"/>
+          <w:szCs w:val="21"/>
+        </w:rPr>
+        <w:t xml:space="preserve">One Section 6 row was computed on the pre-correction walk.</w:t>
+      </w:r>
+      <w:r>
+        <w:rPr>
+          <w:rFonts w:ascii="Georgia" w:cs="Georgia" w:eastAsia="Georgia" w:hAnsi="Georgia"/>
+          <w:sz w:val="21"/>
+          <w:szCs w:val="21"/>
+        </w:rPr>
+        <w:t xml:space="preserve"> Of the six rows, only "deprecated package in tree" is derived from the resolved node set; the rest need tarball contents or root metadata that a walk does not carry. Its MCP numerator is 43 of 250, which is the pre-correction figure. The corrected walk gives 42, moving the coverage-corrected rate from 18.0% to approximately 17.6%, inside the interval already reported and leaving the verdict unchanged. The control arm was walked with the same resolver, so the comparison is internally consistent and correcting one arm alone would not improve it. The row is left as published and the residual is recorded here rather than silently carried.</w:t>
+      </w:r>
+    </w:p>
+    <w:p>
+      <w:pPr>
+        <w:spacing w:after="160"/>
+        <w:jc w:val="left"/>
+      </w:pPr>
+      <w:r>
+        <w:rPr>
+          <w:rFonts w:ascii="Georgia" w:cs="Georgia" w:eastAsia="Georgia" w:hAnsi="Georgia"/>
+          <w:sz w:val="21"/>
+          <w:szCs w:val="21"/>
+        </w:rPr>
+        <w:t xml:space="preserve">Two artifacts of the dated re-walk are recorded in </w:t>
       </w:r>
       <w:r>
         <w:rPr>
@@ -11586,15 +11680,15 @@
           <w:sz w:val="19"/>
           <w:szCs w:val="19"/>
         </w:rPr>
-        <w:t xml:space="preserve">walk250.jsonl</w:t>
-      </w:r>
-      <w:r>
-        <w:rPr>
-          <w:rFonts w:ascii="Georgia" w:cs="Georgia" w:eastAsia="Georgia" w:hAnsi="Georgia"/>
-          <w:sz w:val="21"/>
-          <w:szCs w:val="21"/>
-        </w:rPr>
-        <w:t xml:space="preserve"> is its output. Rebuilding the corpus through the corrected resolver moves 160 of 250 trees and 507 nodes, and confirms the figures Section 1 already carries.</w:t>
+        <w:t xml:space="preserve">RESOLVER-NOTES.md</w:t>
+      </w:r>
+      <w:r>
+        <w:rPr>
+          <w:rFonts w:ascii="Georgia" w:cs="Georgia" w:eastAsia="Georgia" w:hAnsi="Georgia"/>
+          <w:sz w:val="21"/>
+          <w:szCs w:val="21"/>
+        </w:rPr>
+        <w:t xml:space="preserve"> rather than here, because both were mine and neither reached the paper. The time-travel path dropped two roots that publish only prereleases, which read as a 5% corpus shrink, and then, once fixed, resolved one of them to a higher prerelease than its own tag, which read as the maximum growing to 604. The rule change is small and stable; the machinery built to isolate it produced two larger and more interesting false results first.</w:t>
       </w:r>
     </w:p>
     <w:p>
@@ -11610,15 +11704,15 @@
           <w:sz w:val="21"/>
           <w:szCs w:val="21"/>
         </w:rPr>
-        <w:t xml:space="preserve">New result: ten days of registry movement changes 73.6% of servers</w:t>
-      </w:r>
-      <w:r>
-        <w:rPr>
-          <w:rFonts w:ascii="Georgia" w:cs="Georgia" w:eastAsia="Georgia" w:hAnsi="Georgia"/>
-          <w:sz w:val="21"/>
-          <w:szCs w:val="21"/>
-        </w:rPr>
-        <w:t xml:space="preserve">, reported in Section 1. The decomposition is exact: 507 nodes from the resolver correction, 12 from drift, 495 combined and 495 measured directly.</w:t>
+        <w:t xml:space="preserve">3.6</w:t>
+      </w:r>
+      <w:r>
+        <w:rPr>
+          <w:rFonts w:ascii="Georgia" w:cs="Georgia" w:eastAsia="Georgia" w:hAnsi="Georgia"/>
+          <w:sz w:val="21"/>
+          <w:szCs w:val="21"/>
+        </w:rPr>
+        <w:t xml:space="preserve"> Two method sentences corrected, Section 1 restated on a released file, and three qualifications added to the drift result. No empirical finding changes.</w:t>
       </w:r>
     </w:p>
     <w:p>
@@ -11634,15 +11728,15 @@
           <w:sz w:val="21"/>
           <w:szCs w:val="21"/>
         </w:rPr>
-        <w:t xml:space="preserve">One Section 6 row was computed on the pre-correction walk.</w:t>
-      </w:r>
-      <w:r>
-        <w:rPr>
-          <w:rFonts w:ascii="Georgia" w:cs="Georgia" w:eastAsia="Georgia" w:hAnsi="Georgia"/>
-          <w:sz w:val="21"/>
-          <w:szCs w:val="21"/>
-        </w:rPr>
-        <w:t xml:space="preserve"> Of the six rows, only "deprecated package in tree" is derived from the resolved node set; the rest need tarball contents or root metadata that a walk does not carry. Its MCP numerator is 43 of 250, which is the pre-correction figure. The corrected walk gives 42, moving the coverage-corrected rate from 18.0% to approximately 17.6%, inside the interval already reported and leaving the verdict unchanged. The control arm was walked with the same resolver, so the comparison is internally consistent and correcting one arm alone would not improve it. The row is left as published and the residual is recorded here rather than silently carried.</w:t>
+        <w:t xml:space="preserve">Section 1 described the drift measurement as two walks ten days apart, and as "two cold starts".</w:t>
+      </w:r>
+      <w:r>
+        <w:rPr>
+          <w:rFonts w:ascii="Georgia" w:cs="Georgia" w:eastAsia="Georgia" w:hAnsi="Georgia"/>
+          <w:sz w:val="21"/>
+          <w:szCs w:val="21"/>
+        </w:rPr>
+        <w:t xml:space="preserve"> Both runs were made on 2026-09-17, and the earlier registry state was rebuilt by discarding versions published after 2026-09-07. A reader writing about the result copied the sentence in good faith, which is how the imprecision surfaced.</w:t>
       </w:r>
     </w:p>
     <w:p>
@@ -11653,10 +11747,20 @@
       <w:r>
         <w:rPr>
           <w:rFonts w:ascii="Georgia" w:cs="Georgia" w:eastAsia="Georgia" w:hAnsi="Georgia"/>
-          <w:sz w:val="21"/>
-          <w:szCs w:val="21"/>
-        </w:rPr>
-        <w:t xml:space="preserve">Two artifacts of the dated re-walk are recorded in </w:t>
+          <w:b/>
+          <w:bCs/>
+          <w:sz w:val="21"/>
+          <w:szCs w:val="21"/>
+        </w:rPr>
+        <w:t xml:space="preserve">Section 1's tree statistics now come from a file a reader can run.</w:t>
+      </w:r>
+      <w:r>
+        <w:rPr>
+          <w:rFonts w:ascii="Georgia" w:cs="Georgia" w:eastAsia="Georgia" w:hAnsi="Georgia"/>
+          <w:sz w:val="21"/>
+          <w:szCs w:val="21"/>
+        </w:rPr>
+        <w:t xml:space="preserve"> Revisions 3.2 to 3.5 reported a median of 93 and a maximum of 618 from a corrected walk that no longer exists, which the 3.5 notes above already recorded. Section 1 now reports 94 and 619 from </w:t>
       </w:r>
       <w:r>
         <w:rPr>
@@ -11664,87 +11768,15 @@
           <w:sz w:val="19"/>
           <w:szCs w:val="19"/>
         </w:rPr>
-        <w:t xml:space="preserve">RESOLVER-NOTES.md</w:t>
-      </w:r>
-      <w:r>
-        <w:rPr>
-          <w:rFonts w:ascii="Georgia" w:cs="Georgia" w:eastAsia="Georgia" w:hAnsi="Georgia"/>
-          <w:sz w:val="21"/>
-          <w:szCs w:val="21"/>
-        </w:rPr>
-        <w:t xml:space="preserve"> rather than here, because both were mine and neither reached the paper. The time-travel path dropped two roots that publish only prereleases, which read as a 5% corpus shrink, and then, once fixed, resolved one of them to a higher prerelease than its own tag, which read as the maximum growing to 604. The rule change is small and stable; the machinery built to isolate it produced two larger and more interesting false results first.</w:t>
-      </w:r>
-    </w:p>
-    <w:p>
-      <w:pPr>
-        <w:spacing w:after="160"/>
-        <w:jc w:val="left"/>
-      </w:pPr>
-      <w:r>
-        <w:rPr>
-          <w:rFonts w:ascii="Georgia" w:cs="Georgia" w:eastAsia="Georgia" w:hAnsi="Georgia"/>
-          <w:b/>
-          <w:bCs/>
-          <w:sz w:val="21"/>
-          <w:szCs w:val="21"/>
-        </w:rPr>
-        <w:t xml:space="preserve">3.6</w:t>
-      </w:r>
-      <w:r>
-        <w:rPr>
-          <w:rFonts w:ascii="Georgia" w:cs="Georgia" w:eastAsia="Georgia" w:hAnsi="Georgia"/>
-          <w:sz w:val="21"/>
-          <w:szCs w:val="21"/>
-        </w:rPr>
-        <w:t xml:space="preserve"> Two method sentences corrected, Section 1 restated on a released file, and three qualifications added to the drift result. No empirical finding changes.</w:t>
-      </w:r>
-    </w:p>
-    <w:p>
-      <w:pPr>
-        <w:spacing w:after="160"/>
-        <w:jc w:val="left"/>
-      </w:pPr>
-      <w:r>
-        <w:rPr>
-          <w:rFonts w:ascii="Georgia" w:cs="Georgia" w:eastAsia="Georgia" w:hAnsi="Georgia"/>
-          <w:b/>
-          <w:bCs/>
-          <w:sz w:val="21"/>
-          <w:szCs w:val="21"/>
-        </w:rPr>
-        <w:t xml:space="preserve">Section 1 described the drift measurement as two walks ten days apart, and as "two cold starts".</w:t>
-      </w:r>
-      <w:r>
-        <w:rPr>
-          <w:rFonts w:ascii="Georgia" w:cs="Georgia" w:eastAsia="Georgia" w:hAnsi="Georgia"/>
-          <w:sz w:val="21"/>
-          <w:szCs w:val="21"/>
-        </w:rPr>
-        <w:t xml:space="preserve"> Both runs were made on 2026-09-17, and the earlier registry state was rebuilt by discarding versions published after 2026-09-07. A reader writing about the result copied the sentence in good faith, which is how the imprecision surfaced.</w:t>
-      </w:r>
-    </w:p>
-    <w:p>
-      <w:pPr>
-        <w:spacing w:after="160"/>
-        <w:jc w:val="left"/>
-      </w:pPr>
-      <w:r>
-        <w:rPr>
-          <w:rFonts w:ascii="Georgia" w:cs="Georgia" w:eastAsia="Georgia" w:hAnsi="Georgia"/>
-          <w:b/>
-          <w:bCs/>
-          <w:sz w:val="21"/>
-          <w:szCs w:val="21"/>
-        </w:rPr>
-        <w:t xml:space="preserve">Section 1's tree statistics now come from a file a reader can run.</w:t>
-      </w:r>
-      <w:r>
-        <w:rPr>
-          <w:rFonts w:ascii="Georgia" w:cs="Georgia" w:eastAsia="Georgia" w:hAnsi="Georgia"/>
-          <w:sz w:val="21"/>
-          <w:szCs w:val="21"/>
-        </w:rPr>
-        <w:t xml:space="preserve"> Revisions 3.2 to 3.5 reported a median of 93 and a maximum of 618 from a corrected walk that no longer exists, which the 3.5 notes above already recorded. Section 1 now reports 94 and 619 from </w:t>
+        <w:t xml:space="preserve">data/walk250_corrected_today.jsonl</w:t>
+      </w:r>
+      <w:r>
+        <w:rPr>
+          <w:rFonts w:ascii="Georgia" w:cs="Georgia" w:eastAsia="Georgia" w:hAnsi="Georgia"/>
+          <w:sz w:val="21"/>
+          <w:szCs w:val="21"/>
+        </w:rPr>
+        <w:t xml:space="preserve">, and names what the dated walk gives. </w:t>
       </w:r>
       <w:r>
         <w:rPr>
@@ -11752,15 +11784,63 @@
           <w:sz w:val="19"/>
           <w:szCs w:val="19"/>
         </w:rPr>
-        <w:t xml:space="preserve">data/walk250_corrected_today.jsonl</w:t>
-      </w:r>
-      <w:r>
-        <w:rPr>
-          <w:rFonts w:ascii="Georgia" w:cs="Georgia" w:eastAsia="Georgia" w:hAnsi="Georgia"/>
-          <w:sz w:val="21"/>
-          <w:szCs w:val="21"/>
-        </w:rPr>
-        <w:t xml:space="preserve">, and names what the dated walk gives. </w:t>
+        <w:t xml:space="preserve">spec/mcp-lock-spec.md</w:t>
+      </w:r>
+      <w:r>
+        <w:rPr>
+          <w:rFonts w:ascii="Georgia" w:cs="Georgia" w:eastAsia="Georgia" w:hAnsi="Georgia"/>
+          <w:sz w:val="21"/>
+          <w:szCs w:val="21"/>
+        </w:rPr>
+        <w:t xml:space="preserve"> carried the two figures from the paper and is updated with it.</w:t>
+      </w:r>
+    </w:p>
+    <w:p>
+      <w:pPr>
+        <w:spacing w:after="160"/>
+        <w:jc w:val="left"/>
+      </w:pPr>
+      <w:r>
+        <w:rPr>
+          <w:rFonts w:ascii="Georgia" w:cs="Georgia" w:eastAsia="Georgia" w:hAnsi="Georgia"/>
+          <w:b/>
+          <w:bCs/>
+          <w:sz w:val="21"/>
+          <w:szCs w:val="21"/>
+        </w:rPr>
+        <w:t xml:space="preserve">The drift result now carries its own limits</w:t>
+      </w:r>
+      <w:r>
+        <w:rPr>
+          <w:rFonts w:ascii="Georgia" w:cs="Georgia" w:eastAsia="Georgia" w:hAnsi="Georgia"/>
+          <w:sz w:val="21"/>
+          <w:szCs w:val="21"/>
+        </w:rPr>
+        <w:t xml:space="preserve">: that it is a resolver result and not an install, that the rebuilt state cannot see unpublished versions or historical deprecation flags so 184 is a floor on those two counts, and that the count survives removing the packages the dist-tag defect touches.</w:t>
+      </w:r>
+    </w:p>
+    <w:p>
+      <w:pPr>
+        <w:spacing w:after="160"/>
+        <w:jc w:val="left"/>
+      </w:pPr>
+      <w:r>
+        <w:rPr>
+          <w:rFonts w:ascii="Georgia" w:cs="Georgia" w:eastAsia="Georgia" w:hAnsi="Georgia"/>
+          <w:b/>
+          <w:bCs/>
+          <w:sz w:val="21"/>
+          <w:szCs w:val="21"/>
+        </w:rPr>
+        <w:t xml:space="preserve">3.8</w:t>
+      </w:r>
+      <w:r>
+        <w:rPr>
+          <w:rFonts w:ascii="Georgia" w:cs="Georgia" w:eastAsia="Georgia" w:hAnsi="Georgia"/>
+          <w:sz w:val="21"/>
+          <w:szCs w:val="21"/>
+        </w:rPr>
+        <w:t xml:space="preserve"> No measurement changes. The archive reference was wrong in a way the paper had been asserting since 3.4: the concept DOI resolves to the most recent version Zenodo has archived, and the most recent archived version is the record labelled 3.3, which carries the 3.1 tree. Everything from 3.4 onward exists only as a git tag. Section 11 now says so and tells a reader to cite the tag and the commit. </w:t>
       </w:r>
       <w:r>
         <w:rPr>
@@ -11768,63 +11848,15 @@
           <w:sz w:val="19"/>
           <w:szCs w:val="19"/>
         </w:rPr>
-        <w:t xml:space="preserve">spec/mcp-lock-spec.md</w:t>
-      </w:r>
-      <w:r>
-        <w:rPr>
-          <w:rFonts w:ascii="Georgia" w:cs="Georgia" w:eastAsia="Georgia" w:hAnsi="Georgia"/>
-          <w:sz w:val="21"/>
-          <w:szCs w:val="21"/>
-        </w:rPr>
-        <w:t xml:space="preserve"> carried the two figures from the paper and is updated with it.</w:t>
-      </w:r>
-    </w:p>
-    <w:p>
-      <w:pPr>
-        <w:spacing w:after="160"/>
-        <w:jc w:val="left"/>
-      </w:pPr>
-      <w:r>
-        <w:rPr>
-          <w:rFonts w:ascii="Georgia" w:cs="Georgia" w:eastAsia="Georgia" w:hAnsi="Georgia"/>
-          <w:b/>
-          <w:bCs/>
-          <w:sz w:val="21"/>
-          <w:szCs w:val="21"/>
-        </w:rPr>
-        <w:t xml:space="preserve">The drift result now carries its own limits</w:t>
-      </w:r>
-      <w:r>
-        <w:rPr>
-          <w:rFonts w:ascii="Georgia" w:cs="Georgia" w:eastAsia="Georgia" w:hAnsi="Georgia"/>
-          <w:sz w:val="21"/>
-          <w:szCs w:val="21"/>
-        </w:rPr>
-        <w:t xml:space="preserve">: that it is a resolver result and not an install, that the rebuilt state cannot see unpublished versions or historical deprecation flags so 184 is a floor on those two counts, and that the count survives removing the packages the dist-tag defect touches.</w:t>
-      </w:r>
-    </w:p>
-    <w:p>
-      <w:pPr>
-        <w:spacing w:after="160"/>
-        <w:jc w:val="left"/>
-      </w:pPr>
-      <w:r>
-        <w:rPr>
-          <w:rFonts w:ascii="Georgia" w:cs="Georgia" w:eastAsia="Georgia" w:hAnsi="Georgia"/>
-          <w:b/>
-          <w:bCs/>
-          <w:sz w:val="21"/>
-          <w:szCs w:val="21"/>
-        </w:rPr>
-        <w:t xml:space="preserve">3.8</w:t>
-      </w:r>
-      <w:r>
-        <w:rPr>
-          <w:rFonts w:ascii="Georgia" w:cs="Georgia" w:eastAsia="Georgia" w:hAnsi="Georgia"/>
-          <w:sz w:val="21"/>
-          <w:szCs w:val="21"/>
-        </w:rPr>
-        <w:t xml:space="preserve"> No measurement changes. The archive reference was wrong in a way the paper had been asserting since 3.4: the concept DOI resolves to the most recent version Zenodo has archived, and the most recent archived version is the record labelled 3.3, which carries the 3.1 tree. Everything from 3.4 onward exists only as a git tag. Section 11 now says so and tells a reader to cite the tag and the commit. </w:t>
+        <w:t xml:space="preserve">CITATION.cff</w:t>
+      </w:r>
+      <w:r>
+        <w:rPr>
+          <w:rFonts w:ascii="Georgia" w:cs="Georgia" w:eastAsia="Georgia" w:hAnsi="Georgia"/>
+          <w:sz w:val="21"/>
+          <w:szCs w:val="21"/>
+        </w:rPr>
+        <w:t xml:space="preserve"> and </w:t>
       </w:r>
       <w:r>
         <w:rPr>
@@ -11832,15 +11864,39 @@
           <w:sz w:val="19"/>
           <w:szCs w:val="19"/>
         </w:rPr>
-        <w:t xml:space="preserve">CITATION.cff</w:t>
-      </w:r>
-      <w:r>
-        <w:rPr>
-          <w:rFonts w:ascii="Georgia" w:cs="Georgia" w:eastAsia="Georgia" w:hAnsi="Georgia"/>
-          <w:sz w:val="21"/>
-          <w:szCs w:val="21"/>
-        </w:rPr>
-        <w:t xml:space="preserve"> and </w:t>
+        <w:t xml:space="preserve">.zenodo.json</w:t>
+      </w:r>
+      <w:r>
+        <w:rPr>
+          <w:rFonts w:ascii="Georgia" w:cs="Georgia" w:eastAsia="Georgia" w:hAnsi="Georgia"/>
+          <w:sz w:val="21"/>
+          <w:szCs w:val="21"/>
+        </w:rPr>
+        <w:t xml:space="preserve"> carried version 3.6.0 inside the 3.7 tree, which is what Zenodo reads when it archives, and now carry 3.8.0.</w:t>
+      </w:r>
+    </w:p>
+    <w:p>
+      <w:pPr>
+        <w:spacing w:after="160"/>
+        <w:jc w:val="left"/>
+      </w:pPr>
+      <w:r>
+        <w:rPr>
+          <w:rFonts w:ascii="Georgia" w:cs="Georgia" w:eastAsia="Georgia" w:hAnsi="Georgia"/>
+          <w:b/>
+          <w:bCs/>
+          <w:sz w:val="21"/>
+          <w:szCs w:val="21"/>
+        </w:rPr>
+        <w:t xml:space="preserve">3.9</w:t>
+      </w:r>
+      <w:r>
+        <w:rPr>
+          <w:rFonts w:ascii="Georgia" w:cs="Georgia" w:eastAsia="Georgia" w:hAnsi="Georgia"/>
+          <w:sz w:val="21"/>
+          <w:szCs w:val="21"/>
+        </w:rPr>
+        <w:t xml:space="preserve"> No measurement changes. The cause this paper gave for the mislabelled 3.3 record is withdrawn. It said Zenodo archived whatever the misplaced tag pointed at, which assumes the GitHub integration created that record. The repository's webhook delivery log shows no deliveries, so the integration appears never to have archived anything and the record's provenance is not established here. The tag placement itself is checkable and stands: </w:t>
       </w:r>
       <w:r>
         <w:rPr>
@@ -11848,15 +11904,29 @@
           <w:sz w:val="19"/>
           <w:szCs w:val="19"/>
         </w:rPr>
-        <w:t xml:space="preserve">.zenodo.json</w:t>
-      </w:r>
-      <w:r>
-        <w:rPr>
-          <w:rFonts w:ascii="Georgia" w:cs="Georgia" w:eastAsia="Georgia" w:hAnsi="Georgia"/>
-          <w:sz w:val="21"/>
-          <w:szCs w:val="21"/>
-        </w:rPr>
-        <w:t xml:space="preserve"> carried version 3.6.0 inside the 3.7 tree, which is what Zenodo reads when it archives, and now carry 3.7.0.</w:t>
+        <w:t xml:space="preserve">v3.3</w:t>
+      </w:r>
+      <w:r>
+        <w:rPr>
+          <w:rFonts w:ascii="Georgia" w:cs="Georgia" w:eastAsia="Georgia" w:hAnsi="Georgia"/>
+          <w:sz w:val="21"/>
+          <w:szCs w:val="21"/>
+        </w:rPr>
+        <w:t xml:space="preserve"> points at the version 3.1 commit, whose own message is "v3.1: correct validation figure".</w:t>
+      </w:r>
+    </w:p>
+    <w:p>
+      <w:pPr>
+        <w:spacing w:after="160"/>
+        <w:jc w:val="left"/>
+      </w:pPr>
+      <w:r>
+        <w:rPr>
+          <w:rFonts w:ascii="Georgia" w:cs="Georgia" w:eastAsia="Georgia" w:hAnsi="Georgia"/>
+          <w:sz w:val="21"/>
+          <w:szCs w:val="21"/>
+        </w:rPr>
+        <w:t xml:space="preserve">This revision exists because 3.8 was published before that edit was made, and a published tag is not rewritten to absorb a later correction.</w:t>
       </w:r>
     </w:p>
     <w:sectPr>

</xml_diff>

<commit_message>
v3.13: stop naming a current archive record, because 3.12's name was wrong
Section 11, README.md and CITATION.cff named the record the concept DOI resolved
to when each revision was written. Every one of them went stale on its own
release, and 3.12's went stale wrongly: it offered "3.10 is the newest archived
version" as a live alternative after 3.11 had already been deposited. The
paragraph now states the invariant, points at the versions list under the
concept DOI, and keeps record 23305959 only as a worked example of the lag.

v3.12 was already published when the edit was made, so it is not rewritten. This
is the same forward repair as 3.9 after 3.8 and 3.11 after 3.10.

Co-Authored-By: Claude Opus 5 <noreply@anthropic.com>
Claude-Session: https://claude.ai/code/session_01LPqG2Nu1nLWwsTWm4LL7jf
</commit_message>
<xml_diff>
--- a/paper/mcp-frame-paper-v3.docx
+++ b/paper/mcp-frame-paper-v3.docx
@@ -10618,7 +10618,21 @@
           <w:sz w:val="21"/>
           <w:szCs w:val="21"/>
         </w:rPr>
-        <w:t xml:space="preserve">, which is not necessarily the most recent version tagged in that repository. No revision can name its own archived record, because the deposit is created by publishing the release that carries that revision, so every record this section can name is one its own release supersedes. At the time of writing the concept DOI resolved to record 23305959, which archives version 3.10: version DOI 10.5281/zenodo.23305959, file </w:t>
+        <w:t xml:space="preserve">, which is not necessarily the most recent version tagged in that repository. No revision can name its own archived record, because the deposit is created by publishing the release that carries that revision, and any record a revision does name is one a later release supersedes. Two revisions named one anyway and both were stale before anyone read them, the second of them wrongly, since it offered "3.10 is the newest archived version" as a live alternative after 3.11 had already been deposited. So this revision names none. The versions list under the concept DOI is the only current answer to which record is the head, and the tag and the commit are the citation that does not move.</w:t>
+      </w:r>
+    </w:p>
+    <w:p>
+      <w:pPr>
+        <w:spacing w:after="160"/>
+        <w:jc w:val="left"/>
+      </w:pPr>
+      <w:r>
+        <w:rPr>
+          <w:rFonts w:ascii="Georgia" w:cs="Georgia" w:eastAsia="Georgia" w:hAnsi="Georgia"/>
+          <w:sz w:val="21"/>
+          <w:szCs w:val="21"/>
+        </w:rPr>
+        <w:t xml:space="preserve">Record 23305959, archiving version 3.10 (version DOI 10.5281/zenodo.23305959, file </w:t>
       </w:r>
       <w:r>
         <w:rPr>
@@ -10650,7 +10664,7 @@
           <w:sz w:val="21"/>
           <w:szCs w:val="21"/>
         </w:rPr>
-        <w:t xml:space="preserve">. If the deposit for this revision fired, the concept DOI now resolves past that record; if it did not, 3.10 is the newest archived version and this revision is reachable only by tag and commit. Either way the tag and the commit are the citation that does not move.</w:t>
+        <w:t xml:space="preserve">), is kept here as a worked example of the lag rather than as the head: it was the head when revision 3.11 was written, and 3.11's own deposit superseded it the moment that release was published.</w:t>
       </w:r>
     </w:p>
     <w:p>
@@ -12339,6 +12353,62 @@
           <w:szCs w:val="21"/>
         </w:rPr>
         <w:t xml:space="preserve"> had been deleting it in full.</w:t>
+      </w:r>
+    </w:p>
+    <w:p>
+      <w:pPr>
+        <w:spacing w:after="160"/>
+        <w:jc w:val="left"/>
+      </w:pPr>
+      <w:r>
+        <w:rPr>
+          <w:rFonts w:ascii="Georgia" w:cs="Georgia" w:eastAsia="Georgia" w:hAnsi="Georgia"/>
+          <w:b/>
+          <w:bCs/>
+          <w:sz w:val="21"/>
+          <w:szCs w:val="21"/>
+        </w:rPr>
+        <w:t xml:space="preserve">3.13</w:t>
+      </w:r>
+      <w:r>
+        <w:rPr>
+          <w:rFonts w:ascii="Georgia" w:cs="Georgia" w:eastAsia="Georgia" w:hAnsi="Georgia"/>
+          <w:sz w:val="21"/>
+          <w:szCs w:val="21"/>
+        </w:rPr>
+        <w:t xml:space="preserve"> No measurement changes. Section 11, </w:t>
+      </w:r>
+      <w:r>
+        <w:rPr>
+          <w:rFonts w:ascii="Consolas" w:cs="Consolas" w:eastAsia="Consolas" w:hAnsi="Consolas"/>
+          <w:sz w:val="19"/>
+          <w:szCs w:val="19"/>
+        </w:rPr>
+        <w:t xml:space="preserve">README.md</w:t>
+      </w:r>
+      <w:r>
+        <w:rPr>
+          <w:rFonts w:ascii="Georgia" w:cs="Georgia" w:eastAsia="Georgia" w:hAnsi="Georgia"/>
+          <w:sz w:val="21"/>
+          <w:szCs w:val="21"/>
+        </w:rPr>
+        <w:t xml:space="preserve"> and </w:t>
+      </w:r>
+      <w:r>
+        <w:rPr>
+          <w:rFonts w:ascii="Consolas" w:cs="Consolas" w:eastAsia="Consolas" w:hAnsi="Consolas"/>
+          <w:sz w:val="19"/>
+          <w:szCs w:val="19"/>
+        </w:rPr>
+        <w:t xml:space="preserve">CITATION.cff</w:t>
+      </w:r>
+      <w:r>
+        <w:rPr>
+          <w:rFonts w:ascii="Georgia" w:cs="Georgia" w:eastAsia="Georgia" w:hAnsi="Georgia"/>
+          <w:sz w:val="21"/>
+          <w:szCs w:val="21"/>
+        </w:rPr>
+        <w:t xml:space="preserve"> stop naming a current archive record. Every revision from 3.10 named the record the concept DOI resolved to when it was written, each went stale on its own release, and 3.12 went stale wrongly: it offered "3.10 is the newest archived version" as a live alternative when 3.11 had already been deposited. The paragraph now states the invariant, points at the versions list under the concept DOI, and keeps record 23305959 only as a worked example of the lag. Revision 3.12 was published before that edit was made, and a published tag is not rewritten to absorb a later correction, which is the same reason 3.9 followed 3.8 and 3.11 followed 3.10.</w:t>
       </w:r>
     </w:p>
     <w:sectPr>

</xml_diff>